<commit_message>
feat: implement resume feature extraction module using SpaCy NER model (best)
</commit_message>
<xml_diff>
--- a/backend/uploads/resume.docx
+++ b/backend/uploads/resume.docx
@@ -16,612 +16,135 @@
       </w:pPr>
       <w:r>
         <w:rPr>
-          <w:noProof/>
-          <w:sz w:val="28"/>
-          <w:szCs w:val="28"/>
-        </w:rPr>
-        <mc:AlternateContent>
-          <mc:Choice Requires="wps">
-            <w:drawing>
-              <wp:anchor distT="0" distB="0" distL="114300" distR="114300" simplePos="0" relativeHeight="251661312" behindDoc="0" locked="0" layoutInCell="1" allowOverlap="1" wp14:anchorId="7677C730" wp14:editId="08220FF3">
-                <wp:simplePos x="0" y="0"/>
-                <wp:positionH relativeFrom="column">
-                  <wp:posOffset>1158240</wp:posOffset>
-                </wp:positionH>
-                <wp:positionV relativeFrom="paragraph">
-                  <wp:posOffset>-350520</wp:posOffset>
-                </wp:positionV>
-                <wp:extent cx="4732020" cy="883920"/>
-                <wp:effectExtent l="0" t="0" r="0" b="0"/>
-                <wp:wrapNone/>
-                <wp:docPr id="1461175550" name="Text Box 3"/>
-                <wp:cNvGraphicFramePr/>
-                <a:graphic xmlns:a="http://schemas.openxmlformats.org/drawingml/2006/main">
-                  <a:graphicData uri="http://schemas.microsoft.com/office/word/2010/wordprocessingShape">
-                    <wps:wsp>
-                      <wps:cNvSpPr txBox="1"/>
-                      <wps:spPr>
-                        <a:xfrm>
-                          <a:off x="0" y="0"/>
-                          <a:ext cx="4732020" cy="883920"/>
-                        </a:xfrm>
-                        <a:prstGeom prst="rect">
-                          <a:avLst/>
-                        </a:prstGeom>
-                        <a:noFill/>
-                        <a:ln w="6350">
-                          <a:noFill/>
-                        </a:ln>
-                      </wps:spPr>
-                      <wps:txbx>
-                        <w:txbxContent>
-                          <w:p>
-                            <w:pPr>
-                              <w:ind w:left="0"/>
-                              <w:rPr>
-                                <w:color w:val="FFFFFF" w:themeColor="background1"/>
-                                <w:sz w:val="96"/>
-                                <w:szCs w:val="96"/>
-                              </w:rPr>
-                            </w:pPr>
-                            <w:r>
-                              <w:rPr>
-                                <w:color w:val="FFFFFF" w:themeColor="background1"/>
-                                <w:sz w:val="96"/>
-                                <w:szCs w:val="96"/>
-                              </w:rPr>
-                              <w:t>Saujanya Shrestha</w:t>
-                            </w:r>
-                          </w:p>
-                        </w:txbxContent>
-                      </wps:txbx>
-                      <wps:bodyPr rot="0" spcFirstLastPara="0" vertOverflow="overflow" horzOverflow="overflow" vert="horz" wrap="square" lIns="91440" tIns="45720" rIns="91440" bIns="45720" numCol="1" spcCol="0" rtlCol="0" fromWordArt="0" anchor="t" anchorCtr="0" forceAA="0" compatLnSpc="1">
-                        <a:prstTxWarp prst="textNoShape">
-                          <a:avLst/>
-                        </a:prstTxWarp>
-                        <a:noAutofit/>
-                      </wps:bodyPr>
-                    </wps:wsp>
-                  </a:graphicData>
-                </a:graphic>
-                <wp14:sizeRelH relativeFrom="margin">
-                  <wp14:pctWidth>0</wp14:pctWidth>
-                </wp14:sizeRelH>
-                <wp14:sizeRelV relativeFrom="margin">
-                  <wp14:pctHeight>0</wp14:pctHeight>
-                </wp14:sizeRelV>
-              </wp:anchor>
-            </w:drawing>
-          </mc:Choice>
-          <mc:Fallback>
-            <w:pict>
-              <v:shapetype w14:anchorId="7677C730" id="_x0000_t202" coordsize="21600,21600" o:spt="202" path="m,l,21600r21600,l21600,xe">
-                <v:stroke joinstyle="miter"/>
-                <v:path gradientshapeok="t" o:connecttype="rect"/>
-              </v:shapetype>
-              <v:shape id="Text Box 3" o:spid="_x0000_s1026" type="#_x0000_t202" style="position:absolute;left:0;text-align:left;margin-left:91.2pt;margin-top:-27.6pt;width:372.6pt;height:69.6pt;z-index:251661312;visibility:visible;mso-wrap-style:square;mso-width-percent:0;mso-height-percent:0;mso-wrap-distance-left:9pt;mso-wrap-distance-top:0;mso-wrap-distance-right:9pt;mso-wrap-distance-bottom:0;mso-position-horizontal:absolute;mso-position-horizontal-relative:text;mso-position-vertical:absolute;mso-position-vertical-relative:text;mso-width-percent:0;mso-height-percent:0;mso-width-relative:margin;mso-height-relative:margin;v-text-anchor:top" o:gfxdata="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" filled="f" stroked="f" strokeweight=".5pt">
-                <v:textbox>
-                  <w:txbxContent>
-                    <w:p>
-                      <w:pPr>
-                        <w:ind w:left="0"/>
-                        <w:rPr>
-                          <w:color w:val="FFFFFF" w:themeColor="background1"/>
-                          <w:sz w:val="96"/>
-                          <w:szCs w:val="96"/>
-                        </w:rPr>
-                      </w:pPr>
-                      <w:r>
-                        <w:rPr>
-                          <w:color w:val="FFFFFF" w:themeColor="background1"/>
-                          <w:sz w:val="96"/>
-                          <w:szCs w:val="96"/>
-                        </w:rPr>
-                        <w:t>Saujanya Shrestha</w:t>
-                      </w:r>
-                    </w:p>
-                  </w:txbxContent>
-                </v:textbox>
-              </v:shape>
-            </w:pict>
-          </mc:Fallback>
-        </mc:AlternateContent>
-      </w:r>
-      <w:r>
-        <w:rPr>
-          <w:noProof/>
-          <w:sz w:val="28"/>
-          <w:szCs w:val="28"/>
-        </w:rPr>
-        <w:drawing>
-          <wp:anchor distT="0" distB="0" distL="114300" distR="114300" simplePos="0" relativeHeight="251660288" behindDoc="0" locked="0" layoutInCell="1" allowOverlap="1" wp14:anchorId="795B6979" wp14:editId="07E57A16">
-            <wp:simplePos x="0" y="0"/>
-            <wp:positionH relativeFrom="column">
-              <wp:posOffset>-358140</wp:posOffset>
-            </wp:positionH>
-            <wp:positionV relativeFrom="paragraph">
-              <wp:posOffset>-472440</wp:posOffset>
-            </wp:positionV>
-            <wp:extent cx="1371600" cy="1675756"/>
-            <wp:effectExtent l="0" t="0" r="0" b="1270"/>
-            <wp:wrapNone/>
-            <wp:docPr id="1908277289" name="Picture 2" descr="A person in a white shirt and tie&#10;&#10;AI-generated content may be incorrect."/>
-            <wp:cNvGraphicFramePr>
-              <a:graphicFrameLocks xmlns:a="http://schemas.openxmlformats.org/drawingml/2006/main" noChangeAspect="1"/>
-            </wp:cNvGraphicFramePr>
-            <a:graphic xmlns:a="http://schemas.openxmlformats.org/drawingml/2006/main">
-              <a:graphicData uri="http://schemas.openxmlformats.org/drawingml/2006/picture">
-                <pic:pic xmlns:pic="http://schemas.openxmlformats.org/drawingml/2006/picture">
-                  <pic:nvPicPr>
-                    <pic:cNvPr id="1908277289" name="Picture 2" descr="A person in a white shirt and tie&#10;&#10;AI-generated content may be incorrect."/>
-                    <pic:cNvPicPr/>
-                  </pic:nvPicPr>
-                  <pic:blipFill>
-                    <a:blip r:embed="rId5" cstate="print">
-                      <a:extLst>
-                        <a:ext uri="{28A0092B-C50C-407E-A947-70E740481C1C}">
-                          <a14:useLocalDpi xmlns:a14="http://schemas.microsoft.com/office/drawing/2010/main" val="0"/>
-                        </a:ext>
-                      </a:extLst>
-                    </a:blip>
-                    <a:stretch>
-                      <a:fillRect/>
-                    </a:stretch>
-                  </pic:blipFill>
-                  <pic:spPr>
-                    <a:xfrm>
-                      <a:off x="0" y="0"/>
-                      <a:ext cx="1377397" cy="1682839"/>
-                    </a:xfrm>
-                    <a:prstGeom prst="rect">
-                      <a:avLst/>
-                    </a:prstGeom>
-                  </pic:spPr>
-                </pic:pic>
-              </a:graphicData>
-            </a:graphic>
-            <wp14:sizeRelH relativeFrom="margin">
-              <wp14:pctWidth>0</wp14:pctWidth>
-            </wp14:sizeRelH>
-            <wp14:sizeRelV relativeFrom="margin">
-              <wp14:pctHeight>0</wp14:pctHeight>
-            </wp14:sizeRelV>
-          </wp:anchor>
-        </w:drawing>
-      </w:r>
-      <w:r>
-        <w:rPr>
           <w:b/>
           <w:bCs/>
-          <w:noProof/>
-          <w:sz w:val="28"/>
-          <w:szCs w:val="28"/>
-        </w:rPr>
-        <mc:AlternateContent>
-          <mc:Choice Requires="wps">
-            <w:drawing>
-              <wp:anchor distT="0" distB="0" distL="114300" distR="114300" simplePos="0" relativeHeight="251659264" behindDoc="0" locked="0" layoutInCell="1" allowOverlap="1" wp14:anchorId="18E60A8C" wp14:editId="62609A0F">
-                <wp:simplePos x="0" y="0"/>
-                <wp:positionH relativeFrom="column">
-                  <wp:posOffset>-361950</wp:posOffset>
-                </wp:positionH>
-                <wp:positionV relativeFrom="paragraph">
-                  <wp:posOffset>-476250</wp:posOffset>
-                </wp:positionV>
-                <wp:extent cx="6448425" cy="1676400"/>
-                <wp:effectExtent l="0" t="0" r="9525" b="0"/>
-                <wp:wrapNone/>
-                <wp:docPr id="1598213121" name="Rectangle 1"/>
-                <wp:cNvGraphicFramePr/>
-                <a:graphic xmlns:a="http://schemas.openxmlformats.org/drawingml/2006/main">
-                  <a:graphicData uri="http://schemas.microsoft.com/office/word/2010/wordprocessingShape">
-                    <wps:wsp>
-                      <wps:cNvSpPr/>
-                      <wps:spPr>
-                        <a:xfrm>
-                          <a:off x="0" y="0"/>
-                          <a:ext cx="6448425" cy="1676400"/>
-                        </a:xfrm>
-                        <a:prstGeom prst="rect">
-                          <a:avLst/>
-                        </a:prstGeom>
-                        <a:solidFill>
-                          <a:srgbClr val="0070C0"/>
-                        </a:solidFill>
-                        <a:ln>
-                          <a:noFill/>
-                        </a:ln>
-                      </wps:spPr>
-                      <wps:style>
-                        <a:lnRef idx="2">
-                          <a:schemeClr val="accent1">
-                            <a:shade val="15000"/>
-                          </a:schemeClr>
-                        </a:lnRef>
-                        <a:fillRef idx="1">
-                          <a:schemeClr val="accent1"/>
-                        </a:fillRef>
-                        <a:effectRef idx="0">
-                          <a:schemeClr val="accent1"/>
-                        </a:effectRef>
-                        <a:fontRef idx="minor">
-                          <a:schemeClr val="lt1"/>
-                        </a:fontRef>
-                      </wps:style>
-                      <wps:txbx>
-                        <w:txbxContent>
-                          <w:p>
-                            <w:pPr>
-                              <w:ind w:left="0"/>
-                              <w:jc w:val="center"/>
-                            </w:pPr>
-                          </w:p>
-                        </w:txbxContent>
-                      </wps:txbx>
-                      <wps:bodyPr rot="0" spcFirstLastPara="0" vertOverflow="overflow" horzOverflow="overflow" vert="horz" wrap="square" lIns="91440" tIns="45720" rIns="91440" bIns="45720" numCol="1" spcCol="0" rtlCol="0" fromWordArt="0" anchor="ctr" anchorCtr="0" forceAA="0" compatLnSpc="1">
-                        <a:prstTxWarp prst="textNoShape">
-                          <a:avLst/>
-                        </a:prstTxWarp>
-                        <a:noAutofit/>
-                      </wps:bodyPr>
-                    </wps:wsp>
-                  </a:graphicData>
-                </a:graphic>
-              </wp:anchor>
-            </w:drawing>
-          </mc:Choice>
-          <mc:Fallback>
-            <w:pict>
-              <v:rect w14:anchorId="18E60A8C" id="Rectangle 1" o:spid="_x0000_s1027" style="position:absolute;left:0;text-align:left;margin-left:-28.5pt;margin-top:-37.5pt;width:507.75pt;height:132pt;z-index:251659264;visibility:visible;mso-wrap-style:square;mso-wrap-distance-left:9pt;mso-wrap-distance-top:0;mso-wrap-distance-right:9pt;mso-wrap-distance-bottom:0;mso-position-horizontal:absolute;mso-position-horizontal-relative:text;mso-position-vertical:absolute;mso-position-vertical-relative:text;v-text-anchor:middle" o:gfxdata="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" fillcolor="#0070c0" stroked="f" strokeweight="1pt">
-                <v:textbox>
-                  <w:txbxContent>
-                    <w:p>
-                      <w:pPr>
-                        <w:ind w:left="0"/>
-                        <w:jc w:val="center"/>
-                      </w:pPr>
-                    </w:p>
-                  </w:txbxContent>
-                </v:textbox>
-              </v:rect>
-            </w:pict>
-          </mc:Fallback>
-        </mc:AlternateContent>
+          <w:sz w:val="28"/>
+          <w:szCs w:val="28"/>
+        </w:rPr>
+        <w:t>Saujanya Shrestha</w:t>
       </w:r>
     </w:p>
     <w:p>
       <w:pPr>
-        <w:spacing w:after="151" w:line="259" w:lineRule="auto"/>
-        <w:ind w:left="243" w:firstLine="0"/>
-        <w:jc w:val="center"/>
+        <w:rPr>
+          <w:sz w:val="28"/>
+          <w:szCs w:val="28"/>
+        </w:rPr>
+      </w:pPr>
+      <w:r>
         <w:rPr>
           <w:b/>
-          <w:bCs/>
-          <w:sz w:val="28"/>
-          <w:szCs w:val="28"/>
-        </w:rPr>
-      </w:pPr>
-      <w:r>
-        <w:rPr>
-          <w:b/>
-          <w:bCs/>
-          <w:noProof/>
-          <w:sz w:val="28"/>
-          <w:szCs w:val="28"/>
-        </w:rPr>
-        <mc:AlternateContent>
-          <mc:Choice Requires="wps">
-            <w:drawing>
-              <wp:anchor distT="0" distB="0" distL="114300" distR="114300" simplePos="0" relativeHeight="251664384" behindDoc="0" locked="0" layoutInCell="1" allowOverlap="1" wp14:anchorId="5A1A7F1B" wp14:editId="4BDBC49C">
-                <wp:simplePos x="0" y="0"/>
-                <wp:positionH relativeFrom="column">
-                  <wp:posOffset>3825240</wp:posOffset>
-                </wp:positionH>
-                <wp:positionV relativeFrom="paragraph">
-                  <wp:posOffset>148590</wp:posOffset>
-                </wp:positionV>
-                <wp:extent cx="2712720" cy="579120"/>
-                <wp:effectExtent l="0" t="0" r="0" b="0"/>
-                <wp:wrapNone/>
-                <wp:docPr id="1488360020" name="Text Box 4"/>
-                <wp:cNvGraphicFramePr/>
-                <a:graphic xmlns:a="http://schemas.openxmlformats.org/drawingml/2006/main">
-                  <a:graphicData uri="http://schemas.microsoft.com/office/word/2010/wordprocessingShape">
-                    <wps:wsp>
-                      <wps:cNvSpPr txBox="1"/>
-                      <wps:spPr>
-                        <a:xfrm>
-                          <a:off x="0" y="0"/>
-                          <a:ext cx="2712720" cy="579120"/>
-                        </a:xfrm>
-                        <a:prstGeom prst="rect">
-                          <a:avLst/>
-                        </a:prstGeom>
-                        <a:noFill/>
-                        <a:ln w="6350">
-                          <a:noFill/>
-                        </a:ln>
-                      </wps:spPr>
-                      <wps:txbx>
-                        <w:txbxContent>
-                          <w:p>
-                            <w:pPr>
-                              <w:spacing w:line="240" w:lineRule="auto"/>
-                              <w:ind w:left="0"/>
-                              <w:rPr>
-                                <w:color w:val="FFFFFF" w:themeColor="background1"/>
-                              </w:rPr>
-                            </w:pPr>
-                            <w:r>
-                              <w:rPr>
-                                <w:color w:val="FFFFFF" w:themeColor="background1"/>
-                              </w:rPr>
-                              <w:t>Phone: 9846602320</w:t>
-                            </w:r>
-                          </w:p>
-                          <w:p>
-                            <w:pPr>
-                              <w:spacing w:line="240" w:lineRule="auto"/>
-                              <w:ind w:left="0"/>
-                              <w:rPr>
-                                <w:color w:val="FFFFFF" w:themeColor="background1"/>
-                              </w:rPr>
-                            </w:pPr>
-                            <w:r>
-                              <w:rPr>
-                                <w:color w:val="FFFFFF" w:themeColor="background1"/>
-                              </w:rPr>
-                              <w:t>DOB: April 26, 2003</w:t>
-                            </w:r>
-                          </w:p>
-                        </w:txbxContent>
-                      </wps:txbx>
-                      <wps:bodyPr rot="0" spcFirstLastPara="0" vertOverflow="overflow" horzOverflow="overflow" vert="horz" wrap="square" lIns="91440" tIns="45720" rIns="91440" bIns="45720" numCol="1" spcCol="0" rtlCol="0" fromWordArt="0" anchor="t" anchorCtr="0" forceAA="0" compatLnSpc="1">
-                        <a:prstTxWarp prst="textNoShape">
-                          <a:avLst/>
-                        </a:prstTxWarp>
-                        <a:noAutofit/>
-                      </wps:bodyPr>
-                    </wps:wsp>
-                  </a:graphicData>
-                </a:graphic>
-                <wp14:sizeRelH relativeFrom="margin">
-                  <wp14:pctWidth>0</wp14:pctWidth>
-                </wp14:sizeRelH>
-              </wp:anchor>
-            </w:drawing>
-          </mc:Choice>
-          <mc:Fallback>
-            <w:pict>
-              <v:shape w14:anchorId="5A1A7F1B" id="Text Box 4" o:spid="_x0000_s1028" type="#_x0000_t202" style="position:absolute;left:0;text-align:left;margin-left:301.2pt;margin-top:11.7pt;width:213.6pt;height:45.6pt;z-index:251664384;visibility:visible;mso-wrap-style:square;mso-width-percent:0;mso-wrap-distance-left:9pt;mso-wrap-distance-top:0;mso-wrap-distance-right:9pt;mso-wrap-distance-bottom:0;mso-position-horizontal:absolute;mso-position-horizontal-relative:text;mso-position-vertical:absolute;mso-position-vertical-relative:text;mso-width-percent:0;mso-width-relative:margin;v-text-anchor:top" o:gfxdata="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" filled="f" stroked="f" strokeweight=".5pt">
-                <v:textbox>
-                  <w:txbxContent>
-                    <w:p>
-                      <w:pPr>
-                        <w:spacing w:line="240" w:lineRule="auto"/>
-                        <w:ind w:left="0"/>
-                        <w:rPr>
-                          <w:color w:val="FFFFFF" w:themeColor="background1"/>
-                        </w:rPr>
-                      </w:pPr>
-                      <w:r>
-                        <w:rPr>
-                          <w:color w:val="FFFFFF" w:themeColor="background1"/>
-                        </w:rPr>
-                        <w:t>Phone: 9846602320</w:t>
-                      </w:r>
-                    </w:p>
-                    <w:p>
-                      <w:pPr>
-                        <w:spacing w:line="240" w:lineRule="auto"/>
-                        <w:ind w:left="0"/>
-                        <w:rPr>
-                          <w:color w:val="FFFFFF" w:themeColor="background1"/>
-                        </w:rPr>
-                      </w:pPr>
-                      <w:r>
-                        <w:rPr>
-                          <w:color w:val="FFFFFF" w:themeColor="background1"/>
-                        </w:rPr>
-                        <w:t>DOB: April 26, 2003</w:t>
-                      </w:r>
-                    </w:p>
-                  </w:txbxContent>
-                </v:textbox>
-              </v:shape>
-            </w:pict>
-          </mc:Fallback>
-        </mc:AlternateContent>
-      </w:r>
-      <w:r>
-        <w:rPr>
-          <w:b/>
-          <w:bCs/>
-          <w:noProof/>
-          <w:sz w:val="28"/>
-          <w:szCs w:val="28"/>
-        </w:rPr>
-        <mc:AlternateContent>
-          <mc:Choice Requires="wps">
-            <w:drawing>
-              <wp:anchor distT="0" distB="0" distL="114300" distR="114300" simplePos="0" relativeHeight="251662336" behindDoc="0" locked="0" layoutInCell="1" allowOverlap="1" wp14:anchorId="03193E5E" wp14:editId="446D95B2">
-                <wp:simplePos x="0" y="0"/>
-                <wp:positionH relativeFrom="column">
-                  <wp:posOffset>1211580</wp:posOffset>
-                </wp:positionH>
-                <wp:positionV relativeFrom="paragraph">
-                  <wp:posOffset>156210</wp:posOffset>
-                </wp:positionV>
-                <wp:extent cx="2712720" cy="579120"/>
-                <wp:effectExtent l="0" t="0" r="0" b="0"/>
-                <wp:wrapNone/>
-                <wp:docPr id="1145029826" name="Text Box 4"/>
-                <wp:cNvGraphicFramePr/>
-                <a:graphic xmlns:a="http://schemas.openxmlformats.org/drawingml/2006/main">
-                  <a:graphicData uri="http://schemas.microsoft.com/office/word/2010/wordprocessingShape">
-                    <wps:wsp>
-                      <wps:cNvSpPr txBox="1"/>
-                      <wps:spPr>
-                        <a:xfrm>
-                          <a:off x="0" y="0"/>
-                          <a:ext cx="2712720" cy="579120"/>
-                        </a:xfrm>
-                        <a:prstGeom prst="rect">
-                          <a:avLst/>
-                        </a:prstGeom>
-                        <a:noFill/>
-                        <a:ln w="6350">
-                          <a:noFill/>
-                        </a:ln>
-                      </wps:spPr>
-                      <wps:txbx>
-                        <w:txbxContent>
-                          <w:p>
-                            <w:pPr>
-                              <w:spacing w:line="240" w:lineRule="auto"/>
-                              <w:ind w:left="0"/>
-                              <w:rPr>
-                                <w:color w:val="FFFFFF" w:themeColor="background1"/>
-                              </w:rPr>
-                            </w:pPr>
-                            <w:r>
-                              <w:rPr>
-                                <w:color w:val="FFFFFF" w:themeColor="background1"/>
-                              </w:rPr>
-                              <w:t xml:space="preserve">Email: </w:t>
-                            </w:r>
-                            <w:hyperlink r:id="rId6" w:history="1">
-                              <w:r>
-                                <w:rPr>
-                                  <w:rStyle w:val="Hyperlink"/>
-                                  <w:color w:val="FFFFFF" w:themeColor="background1"/>
-                                </w:rPr>
-                                <w:t>sentake101@gmail.com</w:t>
-                              </w:r>
-                            </w:hyperlink>
-                          </w:p>
-                          <w:p>
-                            <w:pPr>
-                              <w:spacing w:line="240" w:lineRule="auto"/>
-                              <w:ind w:left="0"/>
-                              <w:rPr>
-                                <w:color w:val="FFFFFF" w:themeColor="background1"/>
-                              </w:rPr>
-                            </w:pPr>
-                            <w:r>
-                              <w:rPr>
-                                <w:color w:val="FFFFFF" w:themeColor="background1"/>
-                              </w:rPr>
-                              <w:t>Linkedin: linkedin.com/in/saujanyashrestha</w:t>
-                            </w:r>
-                          </w:p>
-                        </w:txbxContent>
-                      </wps:txbx>
-                      <wps:bodyPr rot="0" spcFirstLastPara="0" vertOverflow="overflow" horzOverflow="overflow" vert="horz" wrap="square" lIns="91440" tIns="45720" rIns="91440" bIns="45720" numCol="1" spcCol="0" rtlCol="0" fromWordArt="0" anchor="t" anchorCtr="0" forceAA="0" compatLnSpc="1">
-                        <a:prstTxWarp prst="textNoShape">
-                          <a:avLst/>
-                        </a:prstTxWarp>
-                        <a:noAutofit/>
-                      </wps:bodyPr>
-                    </wps:wsp>
-                  </a:graphicData>
-                </a:graphic>
-                <wp14:sizeRelH relativeFrom="margin">
-                  <wp14:pctWidth>0</wp14:pctWidth>
-                </wp14:sizeRelH>
-              </wp:anchor>
-            </w:drawing>
-          </mc:Choice>
-          <mc:Fallback>
-            <w:pict>
-              <v:shape w14:anchorId="03193E5E" id="_x0000_s1029" type="#_x0000_t202" style="position:absolute;left:0;text-align:left;margin-left:95.4pt;margin-top:12.3pt;width:213.6pt;height:45.6pt;z-index:251662336;visibility:visible;mso-wrap-style:square;mso-width-percent:0;mso-wrap-distance-left:9pt;mso-wrap-distance-top:0;mso-wrap-distance-right:9pt;mso-wrap-distance-bottom:0;mso-position-horizontal:absolute;mso-position-horizontal-relative:text;mso-position-vertical:absolute;mso-position-vertical-relative:text;mso-width-percent:0;mso-width-relative:margin;v-text-anchor:top" o:gfxdata="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" filled="f" stroked="f" strokeweight=".5pt">
-                <v:textbox>
-                  <w:txbxContent>
-                    <w:p>
-                      <w:pPr>
-                        <w:spacing w:line="240" w:lineRule="auto"/>
-                        <w:ind w:left="0"/>
-                        <w:rPr>
-                          <w:color w:val="FFFFFF" w:themeColor="background1"/>
-                        </w:rPr>
-                      </w:pPr>
-                      <w:r>
-                        <w:rPr>
-                          <w:color w:val="FFFFFF" w:themeColor="background1"/>
-                        </w:rPr>
-                        <w:t xml:space="preserve">Email: </w:t>
-                      </w:r>
-                      <w:hyperlink r:id="rId7" w:history="1">
-                        <w:r>
-                          <w:rPr>
-                            <w:rStyle w:val="Hyperlink"/>
-                            <w:color w:val="FFFFFF" w:themeColor="background1"/>
-                          </w:rPr>
-                          <w:t>sentake101@gmail.com</w:t>
-                        </w:r>
-                      </w:hyperlink>
-                    </w:p>
-                    <w:p>
-                      <w:pPr>
-                        <w:spacing w:line="240" w:lineRule="auto"/>
-                        <w:ind w:left="0"/>
-                        <w:rPr>
-                          <w:color w:val="FFFFFF" w:themeColor="background1"/>
-                        </w:rPr>
-                      </w:pPr>
-                      <w:r>
-                        <w:rPr>
-                          <w:color w:val="FFFFFF" w:themeColor="background1"/>
-                        </w:rPr>
-                        <w:t>Linkedin: linkedin.com/in/saujanyashrestha</w:t>
-                      </w:r>
-                    </w:p>
-                  </w:txbxContent>
-                </v:textbox>
-              </v:shape>
-            </w:pict>
-          </mc:Fallback>
-        </mc:AlternateContent>
+          <w:sz w:val="28"/>
+          <w:szCs w:val="28"/>
+        </w:rPr>
+        <w:t>Email</w:t>
+      </w:r>
+      <w:r>
+        <w:rPr>
+          <w:sz w:val="28"/>
+          <w:szCs w:val="28"/>
+        </w:rPr>
+        <w:t xml:space="preserve">: sentake101@gmail.com </w:t>
       </w:r>
     </w:p>
     <w:p>
       <w:pPr>
-        <w:spacing w:after="151" w:line="259" w:lineRule="auto"/>
-        <w:ind w:left="243" w:firstLine="0"/>
-        <w:jc w:val="center"/>
+        <w:rPr>
+          <w:sz w:val="28"/>
+          <w:szCs w:val="28"/>
+        </w:rPr>
+      </w:pPr>
+      <w:r>
         <w:rPr>
           <w:b/>
-          <w:bCs/>
-          <w:sz w:val="28"/>
-          <w:szCs w:val="28"/>
-        </w:rPr>
-      </w:pPr>
+          <w:sz w:val="28"/>
+          <w:szCs w:val="28"/>
+        </w:rPr>
+        <w:t>LinkedIn</w:t>
+      </w:r>
+      <w:r>
+        <w:rPr>
+          <w:sz w:val="28"/>
+          <w:szCs w:val="28"/>
+        </w:rPr>
+        <w:t>: linkedin.com/in/</w:t>
+      </w:r>
+      <w:proofErr w:type="spellStart"/>
+      <w:r>
+        <w:rPr>
+          <w:sz w:val="28"/>
+          <w:szCs w:val="28"/>
+        </w:rPr>
+        <w:t>saujanyashrestha</w:t>
+      </w:r>
+      <w:proofErr w:type="spellEnd"/>
+      <w:r>
+        <w:rPr>
+          <w:sz w:val="28"/>
+          <w:szCs w:val="28"/>
+        </w:rPr>
+        <w:t xml:space="preserve"> </w:t>
+      </w:r>
     </w:p>
     <w:p>
       <w:pPr>
-        <w:spacing w:after="151" w:line="259" w:lineRule="auto"/>
-        <w:ind w:left="243" w:firstLine="0"/>
-        <w:jc w:val="center"/>
+        <w:rPr>
+          <w:sz w:val="28"/>
+          <w:szCs w:val="28"/>
+        </w:rPr>
+      </w:pPr>
+      <w:r>
         <w:rPr>
           <w:b/>
-          <w:bCs/>
-          <w:sz w:val="28"/>
-          <w:szCs w:val="28"/>
-        </w:rPr>
-      </w:pPr>
+          <w:sz w:val="28"/>
+          <w:szCs w:val="28"/>
+        </w:rPr>
+        <w:t>Phone</w:t>
+      </w:r>
+      <w:r>
+        <w:rPr>
+          <w:sz w:val="28"/>
+          <w:szCs w:val="28"/>
+        </w:rPr>
+        <w:t>: +</w:t>
+      </w:r>
+      <w:r>
+        <w:rPr>
+          <w:sz w:val="28"/>
+          <w:szCs w:val="28"/>
+        </w:rPr>
+        <w:t>977 9846602320</w:t>
+      </w:r>
+      <w:r>
+        <w:rPr>
+          <w:sz w:val="28"/>
+          <w:szCs w:val="28"/>
+        </w:rPr>
+        <w:t xml:space="preserve"> </w:t>
+      </w:r>
     </w:p>
     <w:p>
       <w:pPr>
-        <w:spacing w:after="151" w:line="259" w:lineRule="auto"/>
-        <w:ind w:left="243" w:firstLine="0"/>
-        <w:jc w:val="center"/>
+        <w:rPr>
+          <w:sz w:val="28"/>
+          <w:szCs w:val="28"/>
+        </w:rPr>
+      </w:pPr>
+      <w:r>
         <w:rPr>
           <w:b/>
-          <w:bCs/>
-          <w:sz w:val="28"/>
-          <w:szCs w:val="28"/>
-        </w:rPr>
-      </w:pPr>
+          <w:sz w:val="28"/>
+          <w:szCs w:val="28"/>
+        </w:rPr>
+        <w:t>Date of Birth</w:t>
+      </w:r>
+      <w:r>
+        <w:rPr>
+          <w:sz w:val="28"/>
+          <w:szCs w:val="28"/>
+        </w:rPr>
+        <w:t xml:space="preserve">: April 26, 2003 </w:t>
+      </w:r>
     </w:p>
     <w:p>
       <w:pPr>
@@ -687,7 +210,23 @@
           <w:sz w:val="28"/>
           <w:szCs w:val="28"/>
         </w:rPr>
-        <w:t>posters for the school’s facebook page. Designed banners for the school’s parent’s day. Worked closely with the client to meet their needs.</w:t>
+        <w:t xml:space="preserve">posters for the school’s </w:t>
+      </w:r>
+      <w:proofErr w:type="spellStart"/>
+      <w:r>
+        <w:rPr>
+          <w:sz w:val="28"/>
+          <w:szCs w:val="28"/>
+        </w:rPr>
+        <w:t>facebook</w:t>
+      </w:r>
+      <w:proofErr w:type="spellEnd"/>
+      <w:r>
+        <w:rPr>
+          <w:sz w:val="28"/>
+          <w:szCs w:val="28"/>
+        </w:rPr>
+        <w:t xml:space="preserve"> page. Designed banners for the school’s parent’s day. Worked closely with the client to meet their needs.</w:t>
       </w:r>
     </w:p>
     <w:p>
@@ -858,7 +397,23 @@
           <w:sz w:val="28"/>
           <w:szCs w:val="28"/>
         </w:rPr>
-        <w:t>Python, Javascript, HTML &amp; CSS, Photoshop, Ms. Word, English Typing (65 wpm)</w:t>
+        <w:t xml:space="preserve">Python, </w:t>
+      </w:r>
+      <w:proofErr w:type="spellStart"/>
+      <w:r>
+        <w:rPr>
+          <w:sz w:val="28"/>
+          <w:szCs w:val="28"/>
+        </w:rPr>
+        <w:t>Javascript</w:t>
+      </w:r>
+      <w:proofErr w:type="spellEnd"/>
+      <w:r>
+        <w:rPr>
+          <w:sz w:val="28"/>
+          <w:szCs w:val="28"/>
+        </w:rPr>
+        <w:t>, HTML &amp; CSS, Photoshop, Ms. Word, English Typing (65 wpm)</w:t>
       </w:r>
     </w:p>
     <w:p>
@@ -2996,29 +2551,6 @@
       <w:contextualSpacing/>
     </w:pPr>
   </w:style>
-  <w:style w:type="character" w:styleId="Hyperlink">
-    <w:name w:val="Hyperlink"/>
-    <w:basedOn w:val="DefaultParagraphFont"/>
-    <w:uiPriority w:val="99"/>
-    <w:unhideWhenUsed/>
-    <w:rsid w:val="00395F63"/>
-    <w:rPr>
-      <w:color w:val="0563C1" w:themeColor="hyperlink"/>
-      <w:u w:val="single"/>
-    </w:rPr>
-  </w:style>
-  <w:style w:type="character" w:styleId="UnresolvedMention">
-    <w:name w:val="Unresolved Mention"/>
-    <w:basedOn w:val="DefaultParagraphFont"/>
-    <w:uiPriority w:val="99"/>
-    <w:semiHidden/>
-    <w:unhideWhenUsed/>
-    <w:rsid w:val="00395F63"/>
-    <w:rPr>
-      <w:color w:val="605E5C"/>
-      <w:shd w:val="clear" w:color="auto" w:fill="E1DFDD"/>
-    </w:rPr>
-  </w:style>
 </w:styles>
 </file>
 

</xml_diff>